<commit_message>
Update CV project dates to 2026
</commit_message>
<xml_diff>
--- a/assets/Taran-Warren-CV.docx
+++ b/assets/Taran-Warren-CV.docx
@@ -466,7 +466,7 @@
           <w:szCs w:val="19"/>
         </w:rPr>
         <w:tab/>
-        <w:t>2025 – Present</w:t>
+        <w:t>2026</w:t>
       </w:r>
     </w:p>
     <w:p>
@@ -572,7 +572,7 @@
           <w:szCs w:val="19"/>
         </w:rPr>
         <w:tab/>
-        <w:t>2024</w:t>
+        <w:t>2026</w:t>
       </w:r>
     </w:p>
     <w:p>
@@ -782,10 +782,10 @@
 <file path=word/numbering.xml><?xml version="1.0" encoding="utf-8"?>
 <w:numbering xmlns:wpc="http://schemas.microsoft.com/office/word/2010/wordprocessingCanvas" xmlns:cx="http://schemas.microsoft.com/office/drawing/2014/chartex" xmlns:cx1="http://schemas.microsoft.com/office/drawing/2015/9/8/chartex" xmlns:cx2="http://schemas.microsoft.com/office/drawing/2015/10/21/chartex" xmlns:cx3="http://schemas.microsoft.com/office/drawing/2016/5/9/chartex" xmlns:cx4="http://schemas.microsoft.com/office/drawing/2016/5/10/chartex" xmlns:cx5="http://schemas.microsoft.com/office/drawing/2016/5/11/chartex" xmlns:cx6="http://schemas.microsoft.com/office/drawing/2016/5/12/chartex" xmlns:cx7="http://schemas.microsoft.com/office/drawing/2016/5/13/chartex" xmlns:cx8="http://schemas.microsoft.com/office/drawing/2016/5/14/chartex" xmlns:mc="http://schemas.openxmlformats.org/markup-compatibility/2006" xmlns:aink="http://schemas.microsoft.com/office/drawing/2016/ink" xmlns:am3d="http://schemas.microsoft.com/office/drawing/2017/model3d" xmlns:o="urn:schemas-microsoft-com:office:office" xmlns:oel="http://schemas.microsoft.com/office/2019/extlst" xmlns:r="http://schemas.openxmlformats.org/officeDocument/2006/relationships" xmlns:m="http://schemas.openxmlformats.org/officeDocument/2006/math" xmlns:v="urn:schemas-microsoft-com:vml" xmlns:wp14="http://schemas.microsoft.com/office/word/2010/wordprocessingDrawing" xmlns:wp="http://schemas.openxmlformats.org/drawingml/2006/wordprocessingDrawing" xmlns:w10="urn:schemas-microsoft-com:office:word" xmlns:w="http://schemas.openxmlformats.org/wordprocessingml/2006/main" xmlns:w14="http://schemas.microsoft.com/office/word/2010/wordml" xmlns:w15="http://schemas.microsoft.com/office/word/2012/wordml" xmlns:w16cex="http://schemas.microsoft.com/office/word/2018/wordml/cex" xmlns:w16cid="http://schemas.microsoft.com/office/word/2016/wordml/cid" xmlns:w16="http://schemas.microsoft.com/office/word/2018/wordml" xmlns:w16du="http://schemas.microsoft.com/office/word/2023/wordml/word16du" xmlns:w16sdtdh="http://schemas.microsoft.com/office/word/2020/wordml/sdtdatahash" xmlns:w16sdtfl="http://schemas.microsoft.com/office/word/2024/wordml/sdtformatlock" xmlns:w16se="http://schemas.microsoft.com/office/word/2015/wordml/symex" xmlns:wpg="http://schemas.microsoft.com/office/word/2010/wordprocessingGroup" xmlns:wpi="http://schemas.microsoft.com/office/word/2010/wordprocessingInk" xmlns:wne="http://schemas.microsoft.com/office/word/2006/wordml" xmlns:wps="http://schemas.microsoft.com/office/word/2010/wordprocessingShape" mc:Ignorable="w14 w15 w16se w16cid w16 w16cex w16sdtdh w16sdtfl w16du wp14">
   <w:abstractNum w:abstractNumId="0" w15:restartNumberingAfterBreak="0">
-    <w:nsid w:val="2F157658"/>
+    <w:nsid w:val="32A80AEA"/>
     <w:multiLevelType w:val="hybridMultilevel"/>
-    <w:tmpl w:val="D2F0CC1C"/>
-    <w:lvl w:ilvl="0" w:tplc="F7FAD1B2">
+    <w:tmpl w:val="BC1E436A"/>
+    <w:lvl w:ilvl="0" w:tplc="A4B0A55C">
       <w:start w:val="1"/>
       <w:numFmt w:val="bullet"/>
       <w:lvlText w:val="•"/>
@@ -794,52 +794,52 @@
         <w:ind w:left="260" w:hanging="180"/>
       </w:pPr>
     </w:lvl>
-    <w:lvl w:ilvl="1" w:tplc="38B24E1A">
+    <w:lvl w:ilvl="1" w:tplc="5DF4D7DA">
       <w:numFmt w:val="decimal"/>
       <w:lvlText w:val=""/>
       <w:lvlJc w:val="left"/>
     </w:lvl>
-    <w:lvl w:ilvl="2" w:tplc="C4C2DE94">
+    <w:lvl w:ilvl="2" w:tplc="8092E9A4">
       <w:numFmt w:val="decimal"/>
       <w:lvlText w:val=""/>
       <w:lvlJc w:val="left"/>
     </w:lvl>
-    <w:lvl w:ilvl="3" w:tplc="70107662">
+    <w:lvl w:ilvl="3" w:tplc="DC6A81F0">
       <w:numFmt w:val="decimal"/>
       <w:lvlText w:val=""/>
       <w:lvlJc w:val="left"/>
     </w:lvl>
-    <w:lvl w:ilvl="4" w:tplc="1CEC00AE">
+    <w:lvl w:ilvl="4" w:tplc="5DD2B614">
       <w:numFmt w:val="decimal"/>
       <w:lvlText w:val=""/>
       <w:lvlJc w:val="left"/>
     </w:lvl>
-    <w:lvl w:ilvl="5" w:tplc="7C2403E0">
+    <w:lvl w:ilvl="5" w:tplc="9564BC3A">
       <w:numFmt w:val="decimal"/>
       <w:lvlText w:val=""/>
       <w:lvlJc w:val="left"/>
     </w:lvl>
-    <w:lvl w:ilvl="6" w:tplc="F790F25C">
+    <w:lvl w:ilvl="6" w:tplc="AF5E1466">
       <w:numFmt w:val="decimal"/>
       <w:lvlText w:val=""/>
       <w:lvlJc w:val="left"/>
     </w:lvl>
-    <w:lvl w:ilvl="7" w:tplc="78AE05F4">
+    <w:lvl w:ilvl="7" w:tplc="FE326A8A">
       <w:numFmt w:val="decimal"/>
       <w:lvlText w:val=""/>
       <w:lvlJc w:val="left"/>
     </w:lvl>
-    <w:lvl w:ilvl="8" w:tplc="DCD67828">
+    <w:lvl w:ilvl="8" w:tplc="B238B780">
       <w:numFmt w:val="decimal"/>
       <w:lvlText w:val=""/>
       <w:lvlJc w:val="left"/>
     </w:lvl>
   </w:abstractNum>
   <w:abstractNum w:abstractNumId="1" w15:restartNumberingAfterBreak="0">
-    <w:nsid w:val="41190AE5"/>
+    <w:nsid w:val="752D15F5"/>
     <w:multiLevelType w:val="hybridMultilevel"/>
-    <w:tmpl w:val="F850A000"/>
-    <w:lvl w:ilvl="0" w:tplc="A21A2ADE">
+    <w:tmpl w:val="F8185DE2"/>
+    <w:lvl w:ilvl="0" w:tplc="38BE2E4C">
       <w:start w:val="1"/>
       <w:numFmt w:val="bullet"/>
       <w:lvlText w:val="●"/>
@@ -848,7 +848,7 @@
         <w:ind w:left="720" w:hanging="360"/>
       </w:pPr>
     </w:lvl>
-    <w:lvl w:ilvl="1" w:tplc="DDCEB07E">
+    <w:lvl w:ilvl="1" w:tplc="6278FF80">
       <w:start w:val="1"/>
       <w:numFmt w:val="bullet"/>
       <w:lvlText w:val="○"/>
@@ -857,7 +857,7 @@
         <w:ind w:left="1440" w:hanging="360"/>
       </w:pPr>
     </w:lvl>
-    <w:lvl w:ilvl="2" w:tplc="6D1AE3F6">
+    <w:lvl w:ilvl="2" w:tplc="5AA86542">
       <w:start w:val="1"/>
       <w:numFmt w:val="bullet"/>
       <w:lvlText w:val="■"/>
@@ -866,7 +866,7 @@
         <w:ind w:left="2160" w:hanging="360"/>
       </w:pPr>
     </w:lvl>
-    <w:lvl w:ilvl="3" w:tplc="16763174">
+    <w:lvl w:ilvl="3" w:tplc="2B500344">
       <w:start w:val="1"/>
       <w:numFmt w:val="bullet"/>
       <w:lvlText w:val="●"/>
@@ -875,7 +875,7 @@
         <w:ind w:left="2880" w:hanging="360"/>
       </w:pPr>
     </w:lvl>
-    <w:lvl w:ilvl="4" w:tplc="8AA41F46">
+    <w:lvl w:ilvl="4" w:tplc="969428D4">
       <w:start w:val="1"/>
       <w:numFmt w:val="bullet"/>
       <w:lvlText w:val="○"/>
@@ -884,7 +884,7 @@
         <w:ind w:left="3600" w:hanging="360"/>
       </w:pPr>
     </w:lvl>
-    <w:lvl w:ilvl="5" w:tplc="424CB51C">
+    <w:lvl w:ilvl="5" w:tplc="9716CF9E">
       <w:start w:val="1"/>
       <w:numFmt w:val="bullet"/>
       <w:lvlText w:val="■"/>
@@ -893,7 +893,7 @@
         <w:ind w:left="4320" w:hanging="360"/>
       </w:pPr>
     </w:lvl>
-    <w:lvl w:ilvl="6" w:tplc="6568E6C0">
+    <w:lvl w:ilvl="6" w:tplc="8152CD9E">
       <w:start w:val="1"/>
       <w:numFmt w:val="bullet"/>
       <w:lvlText w:val="●"/>
@@ -902,7 +902,7 @@
         <w:ind w:left="5040" w:hanging="360"/>
       </w:pPr>
     </w:lvl>
-    <w:lvl w:ilvl="7" w:tplc="06287DCA">
+    <w:lvl w:ilvl="7" w:tplc="BFB06226">
       <w:start w:val="1"/>
       <w:numFmt w:val="bullet"/>
       <w:lvlText w:val="●"/>
@@ -911,7 +911,7 @@
         <w:ind w:left="5760" w:hanging="360"/>
       </w:pPr>
     </w:lvl>
-    <w:lvl w:ilvl="8" w:tplc="23166A90">
+    <w:lvl w:ilvl="8" w:tplc="A92A4B24">
       <w:start w:val="1"/>
       <w:numFmt w:val="bullet"/>
       <w:lvlText w:val="●"/>
@@ -921,13 +921,13 @@
       </w:pPr>
     </w:lvl>
   </w:abstractNum>
-  <w:num w:numId="1" w16cid:durableId="1523665280">
+  <w:num w:numId="1" w16cid:durableId="1703044693">
     <w:abstractNumId w:val="1"/>
     <w:lvlOverride w:ilvl="0">
       <w:startOverride w:val="1"/>
     </w:lvlOverride>
   </w:num>
-  <w:num w:numId="2" w16cid:durableId="812912859">
+  <w:num w:numId="2" w16cid:durableId="100539184">
     <w:abstractNumId w:val="0"/>
     <w:lvlOverride w:ilvl="0">
       <w:startOverride w:val="1"/>

</xml_diff>